<commit_message>
Sign-up journey: plan builder with live cart, payment step, welcome and first steps
- /start: industry, business, base plan, one add-on per screen with a live cart,
  summary with terms; then account, email confirmation and /start/finish
- /start/finish creates the business with the chosen modules, puts the (simulated)
  card on file, sends the welcome email and opens the dashboard with a welcome
- Getting-started checklist on the dashboard (GET /tenants/current/getting-started)
  and a public /getting-started guide
- All start buttons lead to the journey; pricing presets and industry pages preselect it
- Sitemap, robots and a share image; sign-in returns to the page that asked for it
- e2e/signup_journey.py: the whole journey on a phone (he) and a wide screen (en, dark)

Co-Authored-By: Claude Opus 5.5 <noreply@anthropic.com>
Claude-Session: https://claude.ai/code/session_01SZpzm43D2iXn6AgiD8Gxe8
</commit_message>
<xml_diff>
--- a/docs/spec/MyBiz-Spec-en.docx
+++ b/docs/spec/MyBiz-Spec-en.docx
@@ -5798,7 +5798,7 @@
                 <w:szCs w:val="20"/>
                 <w:rtl w:val="false"/>
               </w:rPr>
-              <w:t xml:space="preserve">In progress</w:t>
+              <w:t xml:space="preserve">Done</w:t>
             </w:r>
           </w:p>
         </w:tc>
@@ -5908,7 +5908,7 @@
                 <w:szCs w:val="20"/>
                 <w:rtl w:val="false"/>
               </w:rPr>
-              <w:t xml:space="preserve">Next</w:t>
+              <w:t xml:space="preserve">In progress</w:t>
             </w:r>
           </w:p>
         </w:tc>

</xml_diff>

<commit_message>
Spec v3: phase 2 done (business web app), phase 3 in progress
Co-Authored-By: Claude Opus 5.5 <noreply@anthropic.com>
Claude-Session: https://claude.ai/code/session_01SZpzm43D2iXn6AgiD8Gxe8
</commit_message>
<xml_diff>
--- a/docs/spec/MyBiz-Spec-en.docx
+++ b/docs/spec/MyBiz-Spec-en.docx
@@ -4370,6 +4370,82 @@
     </w:p>
     <w:p>
       <w:pPr>
+        <w:pStyle w:val="ListParagraph"/>
+        <w:numPr>
+          <w:ilvl w:val="0"/>
+          <w:numId w:val="2"/>
+        </w:numPr>
+        <w:bidi w:val="false"/>
+        <w:spacing w:after="60"/>
+        <w:jc w:val="left"/>
+      </w:pPr>
+      <w:r>
+        <w:rPr>
+          <w:rFonts w:ascii="Calibri" w:cs="Calibri" w:eastAsia="Calibri" w:hAnsi="Calibri"/>
+          <w:rtl w:val="false"/>
+        </w:rPr>
+        <w:t xml:space="preserve">Sales: a month of receipts, totals by payment method, CSV export for the accountant.</w:t>
+      </w:r>
+    </w:p>
+    <w:p>
+      <w:pPr>
+        <w:pStyle w:val="ListParagraph"/>
+        <w:numPr>
+          <w:ilvl w:val="0"/>
+          <w:numId w:val="2"/>
+        </w:numPr>
+        <w:bidi w:val="false"/>
+        <w:spacing w:after="60"/>
+        <w:jc w:val="left"/>
+      </w:pPr>
+      <w:r>
+        <w:rPr>
+          <w:rFonts w:ascii="Calibri" w:cs="Calibri" w:eastAsia="Calibri" w:hAnsi="Calibri"/>
+          <w:rtl w:val="false"/>
+        </w:rPr>
+        <w:t xml:space="preserve">My profile: everyone sets the name the team, clients and reports see.</w:t>
+      </w:r>
+    </w:p>
+    <w:p>
+      <w:pPr>
+        <w:pStyle w:val="ListParagraph"/>
+        <w:numPr>
+          <w:ilvl w:val="0"/>
+          <w:numId w:val="2"/>
+        </w:numPr>
+        <w:bidi w:val="false"/>
+        <w:spacing w:after="60"/>
+        <w:jc w:val="left"/>
+      </w:pPr>
+      <w:r>
+        <w:rPr>
+          <w:rFonts w:ascii="Calibri" w:cs="Calibri" w:eastAsia="Calibri" w:hAnsi="Calibri"/>
+          <w:rtl w:val="false"/>
+        </w:rPr>
+        <w:t xml:space="preserve">Locked modules: modules the business doesn't have stay in the menu with a lock and open a preview — what it does, a picture, what changes on the invoice — with one-click "add to plan".</w:t>
+      </w:r>
+    </w:p>
+    <w:p>
+      <w:pPr>
+        <w:pStyle w:val="ListParagraph"/>
+        <w:numPr>
+          <w:ilvl w:val="0"/>
+          <w:numId w:val="2"/>
+        </w:numPr>
+        <w:bidi w:val="false"/>
+        <w:spacing w:after="60"/>
+        <w:jc w:val="left"/>
+      </w:pPr>
+      <w:r>
+        <w:rPr>
+          <w:rFonts w:ascii="Calibri" w:cs="Calibri" w:eastAsia="Calibri" w:hAnsi="Calibri"/>
+          <w:rtl w:val="false"/>
+        </w:rPr>
+        <w:t xml:space="preserve">Getting started: a first-steps checklist on the dashboard for a new business.</w:t>
+      </w:r>
+    </w:p>
+    <w:p>
+      <w:pPr>
         <w:bidi w:val="false"/>
         <w:spacing w:after="120"/>
         <w:jc w:val="left"/>
@@ -4379,7 +4455,7 @@
           <w:rFonts w:ascii="Calibri" w:cs="Calibri" w:eastAsia="Calibri" w:hAnsi="Calibri"/>
           <w:rtl w:val="false"/>
         </w:rPr>
-        <w:t xml:space="preserve">To complete in phase 2: locked modules in the menu with previews and "add to plan", and a full review of every screen.</w:t>
+        <w:t xml:space="preserve">Phase 2 review: every screen checked on phone and computer, Hebrew/light and English/dark, for accessibility, errors and layout (automated crawl plus a visual pass).</w:t>
       </w:r>
     </w:p>
     <w:p>
@@ -5873,7 +5949,7 @@
                 <w:szCs w:val="20"/>
                 <w:rtl w:val="false"/>
               </w:rPr>
-              <w:t xml:space="preserve">Locked modules with previews and upsell; full review and polish</w:t>
+              <w:t xml:space="preserve">Locked modules with previews and upsell; full review and polish; sales; profiles</w:t>
             </w:r>
           </w:p>
         </w:tc>
@@ -5908,7 +5984,7 @@
                 <w:szCs w:val="20"/>
                 <w:rtl w:val="false"/>
               </w:rPr>
-              <w:t xml:space="preserve">In progress</w:t>
+              <w:t xml:space="preserve">Done</w:t>
             </w:r>
           </w:p>
         </w:tc>
@@ -6018,7 +6094,7 @@
                 <w:szCs w:val="20"/>
                 <w:rtl w:val="false"/>
               </w:rPr>
-              <w:t xml:space="preserve">Next</w:t>
+              <w:t xml:space="preserve">In progress</w:t>
             </w:r>
           </w:p>
         </w:tc>

</xml_diff>

<commit_message>
Spec v3: phase 3 done (the MyBiz console), phase 4 in progress
Co-Authored-By: Claude Opus 5.5 <noreply@anthropic.com>
Claude-Session: https://claude.ai/code/session_01SZpzm43D2iXn6AgiD8Gxe8
</commit_message>
<xml_diff>
--- a/docs/spec/MyBiz-Spec-en.docx
+++ b/docs/spec/MyBiz-Spec-en.docx
@@ -4498,7 +4498,7 @@
           <w:rFonts w:ascii="Calibri" w:cs="Calibri" w:eastAsia="Calibri" w:hAnsi="Calibri"/>
           <w:rtl w:val="false"/>
         </w:rPr>
-        <w:t xml:space="preserve">To complete in phase 3:</w:t>
+        <w:t xml:space="preserve">Built in phase 3:</w:t>
       </w:r>
     </w:p>
     <w:p>
@@ -4517,7 +4517,7 @@
           <w:rFonts w:ascii="Calibri" w:cs="Calibri" w:eastAsia="Calibri" w:hAnsi="Calibri"/>
           <w:rtl w:val="false"/>
         </w:rPr>
-        <w:t xml:space="preserve">MyBiz team: primary owner, owners, managers, employees, with permission switches.</w:t>
+        <w:t xml:space="preserve">Its own menu — overview, businesses, inbox, billing, team, audit — where each item appears only for someone who may open it.</w:t>
       </w:r>
     </w:p>
     <w:p>
@@ -4536,7 +4536,7 @@
           <w:rFonts w:ascii="Calibri" w:cs="Calibri" w:eastAsia="Calibri" w:hAnsi="Calibri"/>
           <w:rtl w:val="false"/>
         </w:rPr>
-        <w:t xml:space="preserve">Full visibility: every business, its owners, team and clients.</w:t>
+        <w:t xml:space="preserve">The MyBiz team: a primary owner nobody can remove, change or disable (even through direct database access), owners (partners), managers (who handle employees with the permissions they hold themselves) and employees. People are added by email before they ever sign in, and access can be paused instead of removed.</w:t>
       </w:r>
     </w:p>
     <w:p>
@@ -4555,7 +4555,7 @@
           <w:rFonts w:ascii="Calibri" w:cs="Calibri" w:eastAsia="Calibri" w:hAnsi="Calibri"/>
           <w:rtl w:val="false"/>
         </w:rPr>
-        <w:t xml:space="preserve">Actions on any business (fix data, change modules, extend a trial, credit an invoice), each written to the audit log.</w:t>
+        <w:t xml:space="preserve">Permissions: see businesses, work inside businesses, billing, inbox, usage, manage employees. Every level gives only what it holds, and only owners handle owners and managers.</w:t>
       </w:r>
     </w:p>
     <w:p>
@@ -4574,7 +4574,64 @@
           <w:rFonts w:ascii="Calibri" w:cs="Calibri" w:eastAsia="Calibri" w:hAnsi="Calibri"/>
           <w:rtl w:val="false"/>
         </w:rPr>
-        <w:t xml:space="preserve">Support inbox (contact requests and complaints) with status.</w:t>
+        <w:t xml:space="preserve">Working inside a business: staff who may do it enter any business and work there like a manager, to handle a complaint or fix a mistake — never privacy requests. Every request appears in the business's own log, which its owner reads, with changes marked. Others still need the owner's read-only support grant.</w:t>
+      </w:r>
+    </w:p>
+    <w:p>
+      <w:pPr>
+        <w:pStyle w:val="ListParagraph"/>
+        <w:numPr>
+          <w:ilvl w:val="0"/>
+          <w:numId w:val="2"/>
+        </w:numPr>
+        <w:bidi w:val="false"/>
+        <w:spacing w:after="60"/>
+        <w:jc w:val="left"/>
+      </w:pPr>
+      <w:r>
+        <w:rPr>
+          <w:rFonts w:ascii="Calibri" w:cs="Calibri" w:eastAsia="Calibri" w:hAnsi="Calibri"/>
+          <w:rtl w:val="false"/>
+        </w:rPr>
+        <w:t xml:space="preserve">Actions for the owner: extend the trial, change the plan, credit an invoice — each written to both logs.</w:t>
+      </w:r>
+    </w:p>
+    <w:p>
+      <w:pPr>
+        <w:pStyle w:val="ListParagraph"/>
+        <w:numPr>
+          <w:ilvl w:val="0"/>
+          <w:numId w:val="2"/>
+        </w:numPr>
+        <w:bidi w:val="false"/>
+        <w:spacing w:after="60"/>
+        <w:jc w:val="left"/>
+      </w:pPr>
+      <w:r>
+        <w:rPr>
+          <w:rFonts w:ascii="Calibri" w:cs="Calibri" w:eastAsia="Calibri" w:hAnsi="Calibri"/>
+          <w:rtl w:val="false"/>
+        </w:rPr>
+        <w:t xml:space="preserve">Inbox: requests from the website and messages businesses send from Settings, with status (new, in progress, done), someone handling them and internal notes.</w:t>
+      </w:r>
+    </w:p>
+    <w:p>
+      <w:pPr>
+        <w:pStyle w:val="ListParagraph"/>
+        <w:numPr>
+          <w:ilvl w:val="0"/>
+          <w:numId w:val="2"/>
+        </w:numPr>
+        <w:bidi w:val="false"/>
+        <w:spacing w:after="60"/>
+        <w:jc w:val="left"/>
+      </w:pPr>
+      <w:r>
+        <w:rPr>
+          <w:rFonts w:ascii="Calibri" w:cs="Calibri" w:eastAsia="Calibri" w:hAnsi="Calibri"/>
+          <w:rtl w:val="false"/>
+        </w:rPr>
+        <w:t xml:space="preserve">Audit log (owners only): everything the MyBiz team did.</w:t>
       </w:r>
     </w:p>
     <w:p>
@@ -6094,7 +6151,7 @@
                 <w:szCs w:val="20"/>
                 <w:rtl w:val="false"/>
               </w:rPr>
-              <w:t xml:space="preserve">In progress</w:t>
+              <w:t xml:space="preserve">Done</w:t>
             </w:r>
           </w:p>
         </w:tc>
@@ -6204,7 +6261,7 @@
                 <w:szCs w:val="20"/>
                 <w:rtl w:val="false"/>
               </w:rPr>
-              <w:t xml:space="preserve">After the websites</w:t>
+              <w:t xml:space="preserve">In progress</w:t>
             </w:r>
           </w:p>
         </w:tc>

</xml_diff>

<commit_message>
Spec: phase 4 apps built (business app, MyBiz staff app, shared app kit)
Co-Authored-By: Claude Opus 5.5 <noreply@anthropic.com>
Claude-Session: https://claude.ai/code/session_01SZpzm43D2iXn6AgiD8Gxe8
</commit_message>
<xml_diff>
--- a/docs/spec/MyBiz-Spec-en.docx
+++ b/docs/spec/MyBiz-Spec-en.docx
@@ -4684,7 +4684,7 @@
           <w:rFonts w:ascii="Calibri" w:cs="Calibri" w:eastAsia="Calibri" w:hAnsi="Calibri"/>
           <w:rtl w:val="false"/>
         </w:rPr>
-        <w:t xml:space="preserve">Business app (phase 4): the owner's and staff's day on the go.</w:t>
+        <w:t xml:space="preserve">Business app (built in phase 4): the owner's and staff's day on the go. Today — the day's sessions with check-in of every booked client; Clients — search and a client card with plan, visits and contact; Numbers — the key figures of the last 30 days; Me — profile, language, theme and switching between businesses. Each person sees only what their permissions allow.</w:t>
       </w:r>
     </w:p>
     <w:p>
@@ -4703,7 +4703,45 @@
           <w:rFonts w:ascii="Calibri" w:cs="Calibri" w:eastAsia="Calibri" w:hAnsi="Calibri"/>
           <w:rtl w:val="false"/>
         </w:rPr>
-        <w:t xml:space="preserve">MyBiz staff app (phase 4): businesses, support, alerts.</w:t>
+        <w:t xml:space="preserve">MyBiz staff app (built in phase 4): Home — what needs attention (open requests, new businesses); Businesses — search and a business card; Inbox — handle requests (take, status, notes); Me. Each staff member sees only what their level and permissions allow.</w:t>
+      </w:r>
+    </w:p>
+    <w:p>
+      <w:pPr>
+        <w:pStyle w:val="ListParagraph"/>
+        <w:numPr>
+          <w:ilvl w:val="0"/>
+          <w:numId w:val="2"/>
+        </w:numPr>
+        <w:bidi w:val="false"/>
+        <w:spacing w:after="60"/>
+        <w:jc w:val="left"/>
+      </w:pPr>
+      <w:r>
+        <w:rPr>
+          <w:rFonts w:ascii="Calibri" w:cs="Calibri" w:eastAsia="Calibri" w:hAnsi="Calibri"/>
+          <w:rtl w:val="false"/>
+        </w:rPr>
+        <w:t xml:space="preserve">All three apps share one kit (sign-in, theme, language, right-to-left, accessible components), so a fix in one place reaches all of them.</w:t>
+      </w:r>
+    </w:p>
+    <w:p>
+      <w:pPr>
+        <w:pStyle w:val="ListParagraph"/>
+        <w:numPr>
+          <w:ilvl w:val="0"/>
+          <w:numId w:val="2"/>
+        </w:numPr>
+        <w:bidi w:val="false"/>
+        <w:spacing w:after="60"/>
+        <w:jc w:val="left"/>
+      </w:pPr>
+      <w:r>
+        <w:rPr>
+          <w:rFonts w:ascii="Calibri" w:cs="Calibri" w:eastAsia="Calibri" w:hAnsi="Calibri"/>
+          <w:rtl w:val="false"/>
+        </w:rPr>
+        <w:t xml:space="preserve">Still to do: final polish of the client app and builds for the app stores (at go-live).</w:t>
       </w:r>
     </w:p>
     <w:p>
@@ -6226,7 +6264,7 @@
                 <w:szCs w:val="20"/>
                 <w:rtl w:val="false"/>
               </w:rPr>
-              <w:t xml:space="preserve">Client app polish, business app, MyBiz staff app</w:t>
+              <w:t xml:space="preserve">Business app and MyBiz staff app built, shared app kit; remaining: client app polish and store builds</w:t>
             </w:r>
           </w:p>
         </w:tc>
@@ -6261,7 +6299,7 @@
                 <w:szCs w:val="20"/>
                 <w:rtl w:val="false"/>
               </w:rPr>
-              <w:t xml:space="preserve">In progress</w:t>
+              <w:t xml:space="preserve">Mostly done</w:t>
             </w:r>
           </w:p>
         </w:tc>

</xml_diff>

<commit_message>
Spec: owners, businesses and branches (section 3.4), phase 6; decisions T76-T78
Co-Authored-By: Claude Opus 5.5 <noreply@anthropic.com>
Claude-Session: https://claude.ai/code/session_01SZpzm43D2iXn6AgiD8Gxe8
</commit_message>
<xml_diff>
--- a/docs/spec/MyBiz-Spec-en.docx
+++ b/docs/spec/MyBiz-Spec-en.docx
@@ -1904,6 +1904,203 @@
           <w:rtl w:val="false"/>
         </w:rPr>
         <w:t xml:space="preserve">A client signs in to the client app with an email code, joins businesses with a join code or QR, and only ever sees their own data.</w:t>
+      </w:r>
+    </w:p>
+    <w:p>
+      <w:pPr>
+        <w:pStyle w:val="Heading2"/>
+        <w:bidi w:val="false"/>
+        <w:spacing w:after="140" w:before="280"/>
+        <w:jc w:val="left"/>
+      </w:pPr>
+      <w:r>
+        <w:rPr>
+          <w:rFonts w:ascii="Calibri" w:cs="Calibri" w:eastAsia="Calibri" w:hAnsi="Calibri"/>
+          <w:rtl w:val="false"/>
+        </w:rPr>
+        <w:t xml:space="preserve">3.4 Owners, businesses and branches</w:t>
+      </w:r>
+    </w:p>
+    <w:p>
+      <w:pPr>
+        <w:bidi w:val="false"/>
+        <w:spacing w:after="120"/>
+        <w:jc w:val="left"/>
+      </w:pPr>
+      <w:r>
+        <w:rPr>
+          <w:rFonts w:ascii="Calibri" w:cs="Calibri" w:eastAsia="Calibri" w:hAnsi="Calibri"/>
+          <w:rtl w:val="false"/>
+        </w:rPr>
+        <w:t xml:space="preserve">A MyBiz customer is a person, and a person can own several businesses. For example, Adir owns a chain of pizzerias with four branches and, separately, a barbershop in Tel Aviv with one branch: two businesses, five branches.</w:t>
+      </w:r>
+    </w:p>
+    <w:p>
+      <w:pPr>
+        <w:pStyle w:val="ListParagraph"/>
+        <w:numPr>
+          <w:ilvl w:val="0"/>
+          <w:numId w:val="2"/>
+        </w:numPr>
+        <w:bidi w:val="false"/>
+        <w:spacing w:after="60"/>
+        <w:jc w:val="left"/>
+      </w:pPr>
+      <w:r>
+        <w:rPr>
+          <w:rFonts w:ascii="Calibri" w:cs="Calibri" w:eastAsia="Calibri" w:hAnsi="Calibri"/>
+          <w:b/>
+          <w:bCs/>
+          <w:rtl w:val="false"/>
+        </w:rPr>
+        <w:t xml:space="preserve">Business</w:t>
+      </w:r>
+      <w:r>
+        <w:rPr>
+          <w:rFonts w:ascii="Calibri" w:cs="Calibri" w:eastAsia="Calibri" w:hAnsi="Calibri"/>
+          <w:rtl w:val="false"/>
+        </w:rPr>
+        <w:t xml:space="preserve">: has its own industry, name, brand, team, clients, plan and monthly invoice. Data never mixes between businesses; even the same person's two businesses are separate.</w:t>
+      </w:r>
+    </w:p>
+    <w:p>
+      <w:pPr>
+        <w:pStyle w:val="ListParagraph"/>
+        <w:numPr>
+          <w:ilvl w:val="0"/>
+          <w:numId w:val="2"/>
+        </w:numPr>
+        <w:bidi w:val="false"/>
+        <w:spacing w:after="60"/>
+        <w:jc w:val="left"/>
+      </w:pPr>
+      <w:r>
+        <w:rPr>
+          <w:rFonts w:ascii="Calibri" w:cs="Calibri" w:eastAsia="Calibri" w:hAnsi="Calibri"/>
+          <w:b/>
+          <w:bCs/>
+          <w:rtl w:val="false"/>
+        </w:rPr>
+        <w:t xml:space="preserve">Branch</w:t>
+      </w:r>
+      <w:r>
+        <w:rPr>
+          <w:rFonts w:ascii="Calibri" w:cs="Calibri" w:eastAsia="Calibri" w:hAnsi="Calibri"/>
+          <w:rtl w:val="false"/>
+        </w:rPr>
+        <w:t xml:space="preserve">: a place where the business works, with its own address and rooms. A business starts with one branch; each additional branch is the "extra branch" item on the invoice, which follows the number of active branches.</w:t>
+      </w:r>
+    </w:p>
+    <w:p>
+      <w:pPr>
+        <w:pStyle w:val="ListParagraph"/>
+        <w:numPr>
+          <w:ilvl w:val="0"/>
+          <w:numId w:val="2"/>
+        </w:numPr>
+        <w:bidi w:val="false"/>
+        <w:spacing w:after="60"/>
+        <w:jc w:val="left"/>
+      </w:pPr>
+      <w:r>
+        <w:rPr>
+          <w:rFonts w:ascii="Calibri" w:cs="Calibri" w:eastAsia="Calibri" w:hAnsi="Calibri"/>
+          <w:b/>
+          <w:bCs/>
+          <w:rtl w:val="false"/>
+        </w:rPr>
+        <w:t xml:space="preserve">My businesses</w:t>
+      </w:r>
+      <w:r>
+        <w:rPr>
+          <w:rFonts w:ascii="Calibri" w:cs="Calibri" w:eastAsia="Calibri" w:hAnsi="Calibri"/>
+          <w:rtl w:val="false"/>
+        </w:rPr>
+        <w:t xml:space="preserve">: one page shows every business the person belongs to, with its industry, branches and the key numbers of today and this month; from there they open a business or add a new one. A switcher in the side menu moves between businesses from any page.</w:t>
+      </w:r>
+    </w:p>
+    <w:p>
+      <w:pPr>
+        <w:pStyle w:val="ListParagraph"/>
+        <w:numPr>
+          <w:ilvl w:val="0"/>
+          <w:numId w:val="2"/>
+        </w:numPr>
+        <w:bidi w:val="false"/>
+        <w:spacing w:after="60"/>
+        <w:jc w:val="left"/>
+      </w:pPr>
+      <w:r>
+        <w:rPr>
+          <w:rFonts w:ascii="Calibri" w:cs="Calibri" w:eastAsia="Calibri" w:hAnsi="Calibri"/>
+          <w:b/>
+          <w:bCs/>
+          <w:rtl w:val="false"/>
+        </w:rPr>
+        <w:t xml:space="preserve">Current branch</w:t>
+      </w:r>
+      <w:r>
+        <w:rPr>
+          <w:rFonts w:ascii="Calibri" w:cs="Calibri" w:eastAsia="Calibri" w:hAnsi="Calibri"/>
+          <w:rtl w:val="false"/>
+        </w:rPr>
+        <w:t xml:space="preserve">: inside a business with several branches, a selector in the header chooses "all branches" or one branch. The schedule, the dashboard's numbers, reports, sales and the client list follow it, and new sessions, sales and clients are filed under it.</w:t>
+      </w:r>
+    </w:p>
+    <w:p>
+      <w:pPr>
+        <w:pStyle w:val="ListParagraph"/>
+        <w:numPr>
+          <w:ilvl w:val="0"/>
+          <w:numId w:val="2"/>
+        </w:numPr>
+        <w:bidi w:val="false"/>
+        <w:spacing w:after="60"/>
+        <w:jc w:val="left"/>
+      </w:pPr>
+      <w:r>
+        <w:rPr>
+          <w:rFonts w:ascii="Calibri" w:cs="Calibri" w:eastAsia="Calibri" w:hAnsi="Calibri"/>
+          <w:b/>
+          <w:bCs/>
+          <w:rtl w:val="false"/>
+        </w:rPr>
+        <w:t xml:space="preserve">What belongs to a branch</w:t>
+      </w:r>
+      <w:r>
+        <w:rPr>
+          <w:rFonts w:ascii="Calibri" w:cs="Calibri" w:eastAsia="Calibri" w:hAnsi="Calibri"/>
+          <w:rtl w:val="false"/>
+        </w:rPr>
+        <w:t xml:space="preserve">: sessions and appointments (where they happen), sales (where they were sold), clients (their home branch, optional) and team members (the branches they work at; none means all). Services, plans and prices belong to the whole business.</w:t>
+      </w:r>
+    </w:p>
+    <w:p>
+      <w:pPr>
+        <w:pStyle w:val="ListParagraph"/>
+        <w:numPr>
+          <w:ilvl w:val="0"/>
+          <w:numId w:val="2"/>
+        </w:numPr>
+        <w:bidi w:val="false"/>
+        <w:spacing w:after="60"/>
+        <w:jc w:val="left"/>
+      </w:pPr>
+      <w:r>
+        <w:rPr>
+          <w:rFonts w:ascii="Calibri" w:cs="Calibri" w:eastAsia="Calibri" w:hAnsi="Calibri"/>
+          <w:b/>
+          <w:bCs/>
+          <w:rtl w:val="false"/>
+        </w:rPr>
+        <w:t xml:space="preserve">Roles</w:t>
+      </w:r>
+      <w:r>
+        <w:rPr>
+          <w:rFonts w:ascii="Calibri" w:cs="Calibri" w:eastAsia="Calibri" w:hAnsi="Calibri"/>
+          <w:rtl w:val="false"/>
+        </w:rPr>
+        <w:t xml:space="preserve">: a person's role is per business (owner of one, manager in another). Within a business, a team member assigned to branches sees those branches first; limiting permissions per branch comes later.</w:t>
       </w:r>
     </w:p>
     <w:p>
@@ -8250,7 +8447,117 @@
                 <w:szCs w:val="20"/>
                 <w:rtl w:val="false"/>
               </w:rPr>
-              <w:t xml:space="preserve">6 — More categories</w:t>
+              <w:t xml:space="preserve">6 — Businesses and branches</w:t>
+            </w:r>
+          </w:p>
+        </w:tc>
+        <w:tc>
+          <w:tcPr>
+            <w:tcW w:type="dxa" w:w="3212"/>
+            <w:tcBorders>
+              <w:top w:val="single" w:color="D4D4DC" w:sz="4"/>
+              <w:left w:val="single" w:color="D4D4DC" w:sz="4"/>
+              <w:bottom w:val="single" w:color="D4D4DC" w:sz="4"/>
+              <w:right w:val="single" w:color="D4D4DC" w:sz="4"/>
+            </w:tcBorders>
+            <w:tcMar>
+              <w:top w:type="dxa" w:w="60"/>
+              <w:left w:type="dxa" w:w="100"/>
+              <w:bottom w:type="dxa" w:w="60"/>
+              <w:right w:type="dxa" w:w="100"/>
+            </w:tcMar>
+          </w:tcPr>
+          <w:p>
+            <w:pPr>
+              <w:bidi w:val="false"/>
+              <w:spacing w:after="0"/>
+              <w:jc w:val="left"/>
+            </w:pPr>
+            <w:r>
+              <w:rPr>
+                <w:rFonts w:ascii="Calibri" w:cs="Calibri" w:eastAsia="Calibri" w:hAnsi="Calibri"/>
+                <w:b w:val="false"/>
+                <w:bCs w:val="false"/>
+                <w:sz w:val="20"/>
+                <w:szCs w:val="20"/>
+                <w:rtl w:val="false"/>
+              </w:rPr>
+              <w:t xml:space="preserve">One owner with several businesses, each with several branches: my businesses, a current branch, data and numbers per branch, a full demo</w:t>
+            </w:r>
+          </w:p>
+        </w:tc>
+        <w:tc>
+          <w:tcPr>
+            <w:tcW w:type="dxa" w:w="3214"/>
+            <w:tcBorders>
+              <w:top w:val="single" w:color="D4D4DC" w:sz="4"/>
+              <w:left w:val="single" w:color="D4D4DC" w:sz="4"/>
+              <w:bottom w:val="single" w:color="D4D4DC" w:sz="4"/>
+              <w:right w:val="single" w:color="D4D4DC" w:sz="4"/>
+            </w:tcBorders>
+            <w:tcMar>
+              <w:top w:type="dxa" w:w="60"/>
+              <w:left w:type="dxa" w:w="100"/>
+              <w:bottom w:type="dxa" w:w="60"/>
+              <w:right w:type="dxa" w:w="100"/>
+            </w:tcMar>
+          </w:tcPr>
+          <w:p>
+            <w:pPr>
+              <w:bidi w:val="false"/>
+              <w:spacing w:after="0"/>
+              <w:jc w:val="left"/>
+            </w:pPr>
+            <w:r>
+              <w:rPr>
+                <w:rFonts w:ascii="Calibri" w:cs="Calibri" w:eastAsia="Calibri" w:hAnsi="Calibri"/>
+                <w:b w:val="false"/>
+                <w:bCs w:val="false"/>
+                <w:sz w:val="20"/>
+                <w:szCs w:val="20"/>
+                <w:rtl w:val="false"/>
+              </w:rPr>
+              <w:t xml:space="preserve">In progress</w:t>
+            </w:r>
+          </w:p>
+        </w:tc>
+      </w:tr>
+      <w:tr>
+        <w:trPr>
+          <w:tblHeader w:val="false"/>
+        </w:trPr>
+        <w:tc>
+          <w:tcPr>
+            <w:tcW w:type="dxa" w:w="3212"/>
+            <w:tcBorders>
+              <w:top w:val="single" w:color="D4D4DC" w:sz="4"/>
+              <w:left w:val="single" w:color="D4D4DC" w:sz="4"/>
+              <w:bottom w:val="single" w:color="D4D4DC" w:sz="4"/>
+              <w:right w:val="single" w:color="D4D4DC" w:sz="4"/>
+            </w:tcBorders>
+            <w:tcMar>
+              <w:top w:type="dxa" w:w="60"/>
+              <w:left w:type="dxa" w:w="100"/>
+              <w:bottom w:type="dxa" w:w="60"/>
+              <w:right w:type="dxa" w:w="100"/>
+            </w:tcMar>
+          </w:tcPr>
+          <w:p>
+            <w:pPr>
+              <w:bidi w:val="false"/>
+              <w:spacing w:after="0"/>
+              <w:jc w:val="left"/>
+            </w:pPr>
+            <w:r>
+              <w:rPr>
+                <w:rFonts w:ascii="Calibri" w:cs="Calibri" w:eastAsia="Calibri" w:hAnsi="Calibri"/>
+                <w:b w:val="false"/>
+                <w:bCs w:val="false"/>
+                <w:sz w:val="20"/>
+                <w:szCs w:val="20"/>
+                <w:rtl w:val="false"/>
+              </w:rPr>
+              <w:t xml:space="preserve">7 — More categories</w:t>
             </w:r>
           </w:p>
         </w:tc>

</xml_diff>

<commit_message>
Phase 6: businesses and branches — my businesses, business menu, current branch (#59)
Closes #56, closes #57
</commit_message>
<xml_diff>
--- a/docs/spec/MyBiz-Spec-en.docx
+++ b/docs/spec/MyBiz-Spec-en.docx
@@ -1904,6 +1904,203 @@
           <w:rtl w:val="false"/>
         </w:rPr>
         <w:t xml:space="preserve">A client signs in to the client app with an email code, joins businesses with a join code or QR, and only ever sees their own data.</w:t>
+      </w:r>
+    </w:p>
+    <w:p>
+      <w:pPr>
+        <w:pStyle w:val="Heading2"/>
+        <w:bidi w:val="false"/>
+        <w:spacing w:after="140" w:before="280"/>
+        <w:jc w:val="left"/>
+      </w:pPr>
+      <w:r>
+        <w:rPr>
+          <w:rFonts w:ascii="Calibri" w:cs="Calibri" w:eastAsia="Calibri" w:hAnsi="Calibri"/>
+          <w:rtl w:val="false"/>
+        </w:rPr>
+        <w:t xml:space="preserve">3.4 Owners, businesses and branches</w:t>
+      </w:r>
+    </w:p>
+    <w:p>
+      <w:pPr>
+        <w:bidi w:val="false"/>
+        <w:spacing w:after="120"/>
+        <w:jc w:val="left"/>
+      </w:pPr>
+      <w:r>
+        <w:rPr>
+          <w:rFonts w:ascii="Calibri" w:cs="Calibri" w:eastAsia="Calibri" w:hAnsi="Calibri"/>
+          <w:rtl w:val="false"/>
+        </w:rPr>
+        <w:t xml:space="preserve">A MyBiz customer is a person, and a person can own several businesses. For example, Adir owns a chain of pizzerias with four branches and, separately, a barbershop in Tel Aviv with one branch: two businesses, five branches.</w:t>
+      </w:r>
+    </w:p>
+    <w:p>
+      <w:pPr>
+        <w:pStyle w:val="ListParagraph"/>
+        <w:numPr>
+          <w:ilvl w:val="0"/>
+          <w:numId w:val="2"/>
+        </w:numPr>
+        <w:bidi w:val="false"/>
+        <w:spacing w:after="60"/>
+        <w:jc w:val="left"/>
+      </w:pPr>
+      <w:r>
+        <w:rPr>
+          <w:rFonts w:ascii="Calibri" w:cs="Calibri" w:eastAsia="Calibri" w:hAnsi="Calibri"/>
+          <w:b/>
+          <w:bCs/>
+          <w:rtl w:val="false"/>
+        </w:rPr>
+        <w:t xml:space="preserve">Business</w:t>
+      </w:r>
+      <w:r>
+        <w:rPr>
+          <w:rFonts w:ascii="Calibri" w:cs="Calibri" w:eastAsia="Calibri" w:hAnsi="Calibri"/>
+          <w:rtl w:val="false"/>
+        </w:rPr>
+        <w:t xml:space="preserve">: has its own industry, name, brand, team, clients, plan and monthly invoice. Data never mixes between businesses; even the same person's two businesses are separate.</w:t>
+      </w:r>
+    </w:p>
+    <w:p>
+      <w:pPr>
+        <w:pStyle w:val="ListParagraph"/>
+        <w:numPr>
+          <w:ilvl w:val="0"/>
+          <w:numId w:val="2"/>
+        </w:numPr>
+        <w:bidi w:val="false"/>
+        <w:spacing w:after="60"/>
+        <w:jc w:val="left"/>
+      </w:pPr>
+      <w:r>
+        <w:rPr>
+          <w:rFonts w:ascii="Calibri" w:cs="Calibri" w:eastAsia="Calibri" w:hAnsi="Calibri"/>
+          <w:b/>
+          <w:bCs/>
+          <w:rtl w:val="false"/>
+        </w:rPr>
+        <w:t xml:space="preserve">Branch</w:t>
+      </w:r>
+      <w:r>
+        <w:rPr>
+          <w:rFonts w:ascii="Calibri" w:cs="Calibri" w:eastAsia="Calibri" w:hAnsi="Calibri"/>
+          <w:rtl w:val="false"/>
+        </w:rPr>
+        <w:t xml:space="preserve">: a place where the business works, with its own address and rooms. A business starts with one branch; each additional branch is the "extra branch" item on the invoice, which follows the number of active branches.</w:t>
+      </w:r>
+    </w:p>
+    <w:p>
+      <w:pPr>
+        <w:pStyle w:val="ListParagraph"/>
+        <w:numPr>
+          <w:ilvl w:val="0"/>
+          <w:numId w:val="2"/>
+        </w:numPr>
+        <w:bidi w:val="false"/>
+        <w:spacing w:after="60"/>
+        <w:jc w:val="left"/>
+      </w:pPr>
+      <w:r>
+        <w:rPr>
+          <w:rFonts w:ascii="Calibri" w:cs="Calibri" w:eastAsia="Calibri" w:hAnsi="Calibri"/>
+          <w:b/>
+          <w:bCs/>
+          <w:rtl w:val="false"/>
+        </w:rPr>
+        <w:t xml:space="preserve">My businesses</w:t>
+      </w:r>
+      <w:r>
+        <w:rPr>
+          <w:rFonts w:ascii="Calibri" w:cs="Calibri" w:eastAsia="Calibri" w:hAnsi="Calibri"/>
+          <w:rtl w:val="false"/>
+        </w:rPr>
+        <w:t xml:space="preserve">: one page shows every business the person belongs to, with its industry, branches and the key numbers of today and this month; from there they open a business or add a new one. A switcher in the side menu moves between businesses from any page.</w:t>
+      </w:r>
+    </w:p>
+    <w:p>
+      <w:pPr>
+        <w:pStyle w:val="ListParagraph"/>
+        <w:numPr>
+          <w:ilvl w:val="0"/>
+          <w:numId w:val="2"/>
+        </w:numPr>
+        <w:bidi w:val="false"/>
+        <w:spacing w:after="60"/>
+        <w:jc w:val="left"/>
+      </w:pPr>
+      <w:r>
+        <w:rPr>
+          <w:rFonts w:ascii="Calibri" w:cs="Calibri" w:eastAsia="Calibri" w:hAnsi="Calibri"/>
+          <w:b/>
+          <w:bCs/>
+          <w:rtl w:val="false"/>
+        </w:rPr>
+        <w:t xml:space="preserve">Current branch</w:t>
+      </w:r>
+      <w:r>
+        <w:rPr>
+          <w:rFonts w:ascii="Calibri" w:cs="Calibri" w:eastAsia="Calibri" w:hAnsi="Calibri"/>
+          <w:rtl w:val="false"/>
+        </w:rPr>
+        <w:t xml:space="preserve">: inside a business with several branches, a selector in the header chooses "all branches" or one branch. The schedule, the dashboard's numbers, reports, sales and the client list follow it, and new sessions, sales and clients are filed under it.</w:t>
+      </w:r>
+    </w:p>
+    <w:p>
+      <w:pPr>
+        <w:pStyle w:val="ListParagraph"/>
+        <w:numPr>
+          <w:ilvl w:val="0"/>
+          <w:numId w:val="2"/>
+        </w:numPr>
+        <w:bidi w:val="false"/>
+        <w:spacing w:after="60"/>
+        <w:jc w:val="left"/>
+      </w:pPr>
+      <w:r>
+        <w:rPr>
+          <w:rFonts w:ascii="Calibri" w:cs="Calibri" w:eastAsia="Calibri" w:hAnsi="Calibri"/>
+          <w:b/>
+          <w:bCs/>
+          <w:rtl w:val="false"/>
+        </w:rPr>
+        <w:t xml:space="preserve">What belongs to a branch</w:t>
+      </w:r>
+      <w:r>
+        <w:rPr>
+          <w:rFonts w:ascii="Calibri" w:cs="Calibri" w:eastAsia="Calibri" w:hAnsi="Calibri"/>
+          <w:rtl w:val="false"/>
+        </w:rPr>
+        <w:t xml:space="preserve">: sessions and appointments (where they happen), sales (where they were sold), clients (their home branch, optional) and team members (the branches they work at; none means all). Services, plans and prices belong to the whole business.</w:t>
+      </w:r>
+    </w:p>
+    <w:p>
+      <w:pPr>
+        <w:pStyle w:val="ListParagraph"/>
+        <w:numPr>
+          <w:ilvl w:val="0"/>
+          <w:numId w:val="2"/>
+        </w:numPr>
+        <w:bidi w:val="false"/>
+        <w:spacing w:after="60"/>
+        <w:jc w:val="left"/>
+      </w:pPr>
+      <w:r>
+        <w:rPr>
+          <w:rFonts w:ascii="Calibri" w:cs="Calibri" w:eastAsia="Calibri" w:hAnsi="Calibri"/>
+          <w:b/>
+          <w:bCs/>
+          <w:rtl w:val="false"/>
+        </w:rPr>
+        <w:t xml:space="preserve">Roles</w:t>
+      </w:r>
+      <w:r>
+        <w:rPr>
+          <w:rFonts w:ascii="Calibri" w:cs="Calibri" w:eastAsia="Calibri" w:hAnsi="Calibri"/>
+          <w:rtl w:val="false"/>
+        </w:rPr>
+        <w:t xml:space="preserve">: a person's role is per business (owner of one, manager in another). Within a business, a team member assigned to branches sees those branches first; limiting permissions per branch comes later.</w:t>
       </w:r>
     </w:p>
     <w:p>
@@ -8250,7 +8447,117 @@
                 <w:szCs w:val="20"/>
                 <w:rtl w:val="false"/>
               </w:rPr>
-              <w:t xml:space="preserve">6 — More categories</w:t>
+              <w:t xml:space="preserve">6 — Businesses and branches</w:t>
+            </w:r>
+          </w:p>
+        </w:tc>
+        <w:tc>
+          <w:tcPr>
+            <w:tcW w:type="dxa" w:w="3212"/>
+            <w:tcBorders>
+              <w:top w:val="single" w:color="D4D4DC" w:sz="4"/>
+              <w:left w:val="single" w:color="D4D4DC" w:sz="4"/>
+              <w:bottom w:val="single" w:color="D4D4DC" w:sz="4"/>
+              <w:right w:val="single" w:color="D4D4DC" w:sz="4"/>
+            </w:tcBorders>
+            <w:tcMar>
+              <w:top w:type="dxa" w:w="60"/>
+              <w:left w:type="dxa" w:w="100"/>
+              <w:bottom w:type="dxa" w:w="60"/>
+              <w:right w:type="dxa" w:w="100"/>
+            </w:tcMar>
+          </w:tcPr>
+          <w:p>
+            <w:pPr>
+              <w:bidi w:val="false"/>
+              <w:spacing w:after="0"/>
+              <w:jc w:val="left"/>
+            </w:pPr>
+            <w:r>
+              <w:rPr>
+                <w:rFonts w:ascii="Calibri" w:cs="Calibri" w:eastAsia="Calibri" w:hAnsi="Calibri"/>
+                <w:b w:val="false"/>
+                <w:bCs w:val="false"/>
+                <w:sz w:val="20"/>
+                <w:szCs w:val="20"/>
+                <w:rtl w:val="false"/>
+              </w:rPr>
+              <w:t xml:space="preserve">One owner with several businesses, each with several branches: my businesses, a current branch, data and numbers per branch, a full demo</w:t>
+            </w:r>
+          </w:p>
+        </w:tc>
+        <w:tc>
+          <w:tcPr>
+            <w:tcW w:type="dxa" w:w="3214"/>
+            <w:tcBorders>
+              <w:top w:val="single" w:color="D4D4DC" w:sz="4"/>
+              <w:left w:val="single" w:color="D4D4DC" w:sz="4"/>
+              <w:bottom w:val="single" w:color="D4D4DC" w:sz="4"/>
+              <w:right w:val="single" w:color="D4D4DC" w:sz="4"/>
+            </w:tcBorders>
+            <w:tcMar>
+              <w:top w:type="dxa" w:w="60"/>
+              <w:left w:type="dxa" w:w="100"/>
+              <w:bottom w:type="dxa" w:w="60"/>
+              <w:right w:type="dxa" w:w="100"/>
+            </w:tcMar>
+          </w:tcPr>
+          <w:p>
+            <w:pPr>
+              <w:bidi w:val="false"/>
+              <w:spacing w:after="0"/>
+              <w:jc w:val="left"/>
+            </w:pPr>
+            <w:r>
+              <w:rPr>
+                <w:rFonts w:ascii="Calibri" w:cs="Calibri" w:eastAsia="Calibri" w:hAnsi="Calibri"/>
+                <w:b w:val="false"/>
+                <w:bCs w:val="false"/>
+                <w:sz w:val="20"/>
+                <w:szCs w:val="20"/>
+                <w:rtl w:val="false"/>
+              </w:rPr>
+              <w:t xml:space="preserve">In progress</w:t>
+            </w:r>
+          </w:p>
+        </w:tc>
+      </w:tr>
+      <w:tr>
+        <w:trPr>
+          <w:tblHeader w:val="false"/>
+        </w:trPr>
+        <w:tc>
+          <w:tcPr>
+            <w:tcW w:type="dxa" w:w="3212"/>
+            <w:tcBorders>
+              <w:top w:val="single" w:color="D4D4DC" w:sz="4"/>
+              <w:left w:val="single" w:color="D4D4DC" w:sz="4"/>
+              <w:bottom w:val="single" w:color="D4D4DC" w:sz="4"/>
+              <w:right w:val="single" w:color="D4D4DC" w:sz="4"/>
+            </w:tcBorders>
+            <w:tcMar>
+              <w:top w:type="dxa" w:w="60"/>
+              <w:left w:type="dxa" w:w="100"/>
+              <w:bottom w:type="dxa" w:w="60"/>
+              <w:right w:type="dxa" w:w="100"/>
+            </w:tcMar>
+          </w:tcPr>
+          <w:p>
+            <w:pPr>
+              <w:bidi w:val="false"/>
+              <w:spacing w:after="0"/>
+              <w:jc w:val="left"/>
+            </w:pPr>
+            <w:r>
+              <w:rPr>
+                <w:rFonts w:ascii="Calibri" w:cs="Calibri" w:eastAsia="Calibri" w:hAnsi="Calibri"/>
+                <w:b w:val="false"/>
+                <w:bCs w:val="false"/>
+                <w:sz w:val="20"/>
+                <w:szCs w:val="20"/>
+                <w:rtl w:val="false"/>
+              </w:rPr>
+              <w:t xml:space="preserve">7 — More categories</w:t>
             </w:r>
           </w:p>
         </w:tc>

</xml_diff>

<commit_message>
Documents, retainers and time billing (#45); Professional services opens
- Client documents through the storage provider: staff upload, share and ask
  to sign; clients see shared files, upload papers and sign by name; short-lived
  signed links open a file on a phone.
- Time entries, client retainers and "bill the month": a bill is a quote of
  kind 'bill', paid by the same private link; billed time is locked.
- Professional services category (beta) with accountants, lawyers,
  consultants and agencies; accounting firm demo ("office").
- Web: documents and time on the client card, My time page; client app:
  My documents; business app: log time.
- Decision X14, proposal, status boards (phase 7 done), spec v3, e2e practice.

Closes #45

Co-Authored-By: Claude Opus 5.5 <noreply@anthropic.com>
Claude-Session: https://claude.ai/code/session_01DXeLWobPwwTEm46mvd942P
</commit_message>
<xml_diff>
--- a/docs/spec/MyBiz-Spec-en.docx
+++ b/docs/spec/MyBiz-Spec-en.docx
@@ -4964,7 +4964,18 @@
                 <w:szCs w:val="20"/>
                 <w:rtl w:val="false"/>
               </w:rPr>
-              <w:t xml:space="preserve">Documents and retainers, time-based billing</w:t>
+              <w:t xml:space="preserve">Documents and retainers, time-based billing. </w:t>
+            </w:r>
+            <w:r>
+              <w:rPr>
+                <w:rFonts w:ascii="Calibri" w:cs="Calibri" w:eastAsia="Calibri" w:hAnsi="Calibri"/>
+                <w:b/>
+                <w:bCs/>
+                <w:sz w:val="20"/>
+                <w:szCs w:val="20"/>
+                <w:rtl w:val="false"/>
+              </w:rPr>
+              <w:t xml:space="preserve">Built (#45): Professional services is open as beta</w:t>
             </w:r>
           </w:p>
         </w:tc>

</xml_diff>